<commit_message>
Thesis: front matter and Chapter 1 (Introduction) drafted in the working docx
Co-Authored-By: Claude Fable 5.1 <noreply@anthropic.com>
</commit_message>
<xml_diff>
--- a/docs/thesis/thesis.docx
+++ b/docs/thesis/thesis.docx
@@ -32,7 +32,7 @@
               <w:caps/>
               <w:sz w:val="28"/>
             </w:rPr>
-            <w:t>TITLE OF THESIS</w:t>
+            <w:t xml:space="preserve">ADVANCING ENVIRONMENTAL SUSTAINABILITY THROUGH SATELLITE IMAGERY BASED ESTIMATION OF PM2.5</w:t>
           </w:r>
         </w:p>
       </w:sdtContent>
@@ -80,7 +80,7 @@
               <w:rFonts w:cs="Times New Roman"/>
               <w:b/>
             </w:rPr>
-            <w:t>Your Name</w:t>
+            <w:t xml:space="preserve">Pranay Chimmani</w:t>
           </w:r>
         </w:p>
       </w:sdtContent>
@@ -133,7 +133,7 @@
               <w:rFonts w:cs="Times New Roman"/>
               <w:b/>
             </w:rPr>
-            <w:t>Choose Thesis Type</w:t>
+            <w:t xml:space="preserve">Thesis</w:t>
           </w:r>
         </w:sdtContent>
       </w:sdt>
@@ -221,7 +221,7 @@
               <w:rFonts w:cs="Times New Roman"/>
               <w:b/>
             </w:rPr>
-            <w:t>Choose Degree</w:t>
+            <w:t xml:space="preserve">Master of Science</w:t>
           </w:r>
         </w:p>
       </w:sdtContent>
@@ -459,7 +459,7 @@
             <w:rPr>
               <w:rFonts w:cs="Times New Roman"/>
             </w:rPr>
-            <w:t>Choose Department</w:t>
+            <w:t xml:space="preserve">Department of Computer and Information Technology</w:t>
           </w:r>
         </w:p>
       </w:sdtContent>
@@ -496,7 +496,7 @@
             <w:rPr>
               <w:rFonts w:cs="Times New Roman"/>
             </w:rPr>
-            <w:t>Choose Campus Location</w:t>
+            <w:t xml:space="preserve">West Lafayette</w:t>
           </w:r>
         </w:sdtContent>
       </w:sdt>
@@ -539,7 +539,7 @@
             <w:rPr>
               <w:rFonts w:cs="Times New Roman"/>
             </w:rPr>
-            <w:t>Choose Graduation Term</w:t>
+            <w:t xml:space="preserve">December 2026</w:t>
           </w:r>
         </w:sdtContent>
       </w:sdt>
@@ -688,7 +688,7 @@
               <w:rFonts w:cs="Times New Roman"/>
               <w:b/>
             </w:rPr>
-            <w:t xml:space="preserve">Prof. John Doe, </w:t>
+            <w:t xml:space="preserve">Dr. Chad Laux, Chair</w:t>
           </w:r>
           <w:sdt>
             <w:sdtPr>
@@ -715,7 +715,7 @@
                   <w:rFonts w:cs="Times New Roman"/>
                   <w:b/>
                 </w:rPr>
-                <w:t>Choose committee member type</w:t>
+                <w:t/>
               </w:r>
             </w:sdtContent>
           </w:sdt>
@@ -898,7 +898,7 @@
                 <w:rPr>
                   <w:rFonts w:cs="Times New Roman"/>
                 </w:rPr>
-                <w:t>Choose Department</w:t>
+                <w:t xml:space="preserve">School of Applied and Creative Computing</w:t>
               </w:r>
             </w:p>
           </w:sdtContent>
@@ -935,7 +935,7 @@
               <w:rFonts w:cs="Times New Roman"/>
               <w:b/>
             </w:rPr>
-            <w:t xml:space="preserve">Prof. Jane Doe, </w:t>
+            <w:t xml:space="preserve">Dr. Tawfiq Salem</w:t>
           </w:r>
           <w:sdt>
             <w:sdtPr>
@@ -962,7 +962,7 @@
                   <w:rFonts w:cs="Times New Roman"/>
                   <w:b/>
                 </w:rPr>
-                <w:t>Choose committee member type</w:t>
+                <w:t/>
               </w:r>
             </w:sdtContent>
           </w:sdt>
@@ -1133,7 +1133,7 @@
             <w:rPr>
               <w:rFonts w:cs="Times New Roman"/>
             </w:rPr>
-            <w:t>Choose Department</w:t>
+            <w:t xml:space="preserve">School of Applied and Creative Computing</w:t>
           </w:r>
         </w:p>
       </w:sdtContent>
@@ -1167,7 +1167,7 @@
               <w:rFonts w:cs="Times New Roman"/>
               <w:b/>
             </w:rPr>
-            <w:t>Prof. James Doe, Member</w:t>
+            <w:t xml:space="preserve">Dr. John Springer</w:t>
           </w:r>
         </w:p>
       </w:sdtContent>
@@ -1336,451 +1336,7 @@
             <w:rPr>
               <w:rFonts w:cs="Times New Roman"/>
             </w:rPr>
-            <w:t>Choose Department</w:t>
-          </w:r>
-        </w:p>
-      </w:sdtContent>
-    </w:sdt>
-    <w:p>
-      <w:pPr>
-        <w:jc w:val="center"/>
-        <w:rPr>
-          <w:rFonts w:cs="Times New Roman"/>
-          <w:b/>
-        </w:rPr>
-      </w:pPr>
-      <w:r>
-        <w:rPr>
-          <w:rFonts w:cs="Times New Roman"/>
-          <w:b/>
-          <w:bCs/>
-        </w:rPr>
-        <w:t>Prof.</w:t>
-      </w:r>
-      <w:r>
-        <w:rPr>
-          <w:rFonts w:cs="Times New Roman"/>
-        </w:rPr>
-        <w:t xml:space="preserve"> </w:t>
-      </w:r>
-      <w:sdt>
-        <w:sdtPr>
-          <w:rPr>
-            <w:rFonts w:cs="Times New Roman"/>
-          </w:rPr>
-          <w:id w:val="1509014279"/>
-          <w:placeholder>
-            <w:docPart w:val="4616038E18C3477CBE20FAF95E27F6BB"/>
-          </w:placeholder>
-          <w15:appearance w15:val="hidden"/>
-        </w:sdtPr>
-        <w:sdtEndPr>
-          <w:rPr>
-            <w:b/>
-          </w:rPr>
-        </w:sdtEndPr>
-        <w:sdtContent>
-          <w:r>
-            <w:rPr>
-              <w:rFonts w:cs="Times New Roman"/>
-              <w:b/>
-            </w:rPr>
-            <w:t xml:space="preserve">Add or Delete Committee Member, </w:t>
-          </w:r>
-        </w:sdtContent>
-      </w:sdt>
-      <w:r>
-        <w:rPr>
-          <w:rFonts w:cs="Times New Roman"/>
-          <w:b/>
-        </w:rPr>
-        <w:t>Member</w:t>
-      </w:r>
-    </w:p>
-    <w:sdt>
-      <w:sdtPr>
-        <w:rPr>
-          <w:rFonts w:cs="Times New Roman"/>
-        </w:rPr>
-        <w:alias w:val="Choose Department"/>
-        <w:tag w:val="Choose Department"/>
-        <w:id w:val="2035922211"/>
-        <w:placeholder>
-          <w:docPart w:val="46DD139E7414465EB841336543CD0276"/>
-        </w:placeholder>
-        <w:comboBox>
-          <w:listItem w:displayText="Choose Department" w:value="Choose Department"/>
-          <w:listItem w:displayText="**For committee members external to Purdue, you must manually type the organization name**" w:value="**For committee members external to Purdue, you must manually type the organization name**"/>
-          <w:listItem w:displayText="--- IU INDIANAPOLIS ---" w:value="--- IU INDIANAPOLIS ---"/>
-          <w:listItem w:displayText="Department of Biology" w:value="Department of Biology"/>
-          <w:listItem w:displayText="Department of Chemistry and Chemical Biology " w:value="Department of Chemistry and Chemical Biology "/>
-          <w:listItem w:displayText="Department of Computer and Information Science" w:value="Department of Computer and Information Science"/>
-          <w:listItem w:displayText="Department of Mathematical Sciences" w:value="Department of Mathematical Sciences"/>
-          <w:listItem w:displayText="Department of Physics" w:value="Department of Physics"/>
-          <w:listItem w:displayText="--- PURDUE NORTHWEST ---" w:value="--- PURDUE NORTHWEST ---"/>
-          <w:listItem w:displayText="College of Business at Purdue Northwest" w:value="College of Business at Purdue Northwest"/>
-          <w:listItem w:displayText="College of Engineering and Sciences at Purdue Northwest" w:value="College of Engineering and Sciences at Purdue Northwest"/>
-          <w:listItem w:displayText="College of Humanities, Education, and Social Sciences at Purdue Northwest" w:value="College of Humanities, Education, and Social Sciences at Purdue Northwest"/>
-          <w:listItem w:displayText="College of Nursing at Purdue Northwest" w:value="College of Nursing at Purdue Northwest"/>
-          <w:listItem w:displayText="College of Technology at Purdue Northwest" w:value="College of Technology at Purdue Northwest"/>
-          <w:listItem w:displayText="School of Education and Counseling" w:value="School of Education and Counseling"/>
-          <w:listItem w:displayText="School of Engineering" w:value="School of Engineering"/>
-          <w:listItem w:displayText="White Lodging School of Hospitality and Tourism Management at Purdue Northwest" w:value="White Lodging School of Hospitality and Tourism Management at Purdue Northwest"/>
-          <w:listItem w:displayText="--- PURDUE FORT WAYNE ---" w:value="--- PURDUE FORT WAYNE ---"/>
-          <w:listItem w:displayText=".... Doermer School of Business ...." w:value=".... Doermer School of Business ...."/>
-          <w:listItem w:displayText="Department of Accounting at Purdue Fort Wayne" w:value="Department of Accounting at Purdue Fort Wayne"/>
-          <w:listItem w:displayText="Department of Economics and Finance" w:value="Department of Economics and Finance"/>
-          <w:listItem w:displayText="Department of Hospitality and Tourism Management at Purdue Fort Wayne" w:value="Department of Hospitality and Tourism Management at Purdue Fort Wayne"/>
-          <w:listItem w:displayText="Department of Management and Marketing at Purdue Fort Wayne" w:value="Department of Management and Marketing at Purdue Fort Wayne"/>
-          <w:listItem w:displayText=".... School of Education ...." w:value=".... School of Education ...."/>
-          <w:listItem w:displayText="Department of Counseling and Graduate Education at Purdue Fort Wayne" w:value="Department of Counseling and Graduate Education at Purdue Fort Wayne"/>
-          <w:listItem w:displayText="Department of Human Services at Purdue Fort Wayne" w:value="Department of Human Services at Purdue Fort Wayne"/>
-          <w:listItem w:displayText="Department of Teacher Education at Purdue Fort Wayne" w:value="Department of Teacher Education at Purdue Fort Wayne"/>
-          <w:listItem w:displayText=".... College of Engineering, Technology, and Computer Science ...." w:value=".... College of Engineering, Technology, and Computer Science ...."/>
-          <w:listItem w:displayText="Department of Civil and Mechanical Engineering at Purdue Fort Wayne" w:value="Department of Civil and Mechanical Engineering at Purdue Fort Wayne"/>
-          <w:listItem w:displayText="Department of Computer Science at Purdue Fort Wayne" w:value="Department of Computer Science at Purdue Fort Wayne"/>
-          <w:listItem w:displayText="Department of Electrical and Computer Engineering at Purdue Fort Wayne" w:value="Department of Electrical and Computer Engineering at Purdue Fort Wayne"/>
-          <w:listItem w:displayText="Department of Organizational Leadership at Purdue Fort Wayne" w:value="Department of Organizational Leadership at Purdue Fort Wayne"/>
-          <w:listItem w:displayText="School of Polytechnic at Purdue Fort Wayne" w:value="School of Polytechnic at Purdue Fort Wayne"/>
-          <w:listItem w:displayText=".... College of Liberal Arts (PFW)...." w:value=".... College of Liberal Arts (PFW)...."/>
-          <w:listItem w:displayText="Department of Anthropology and Sociology at Purdue Fort Wayne" w:value="Department of Anthropology and Sociology at Purdue Fort Wayne"/>
-          <w:listItem w:displayText="Department of Communication at Purdue Fort Wayne" w:value="Department of Communication at Purdue Fort Wayne"/>
-          <w:listItem w:displayText="Department of Criminal Justice at Purdue Fort Wayne" w:value="Department of Criminal Justice at Purdue Fort Wayne"/>
-          <w:listItem w:displayText="Department of English at Purdue Fort Wayne" w:value="Department of English at Purdue Fort Wayne"/>
-          <w:listItem w:displayText="Department of History at Purdue Fort Wayne" w:value="Department of History at Purdue Fort Wayne"/>
-          <w:listItem w:displayText="Department of Interdisciplinary Studies at Purdue Fort Wayne" w:value="Department of Interdisciplinary Studies at Purdue Fort Wayne"/>
-          <w:listItem w:displayText="Department of International Languages and Cultures at Purdue Fort Wayne" w:value="Department of International Languages and Cultures at Purdue Fort Wayne"/>
-          <w:listItem w:displayText="Department of Political Science at Purdue Fort Wayne" w:value="Department of Political Science at Purdue Fort Wayne"/>
-          <w:listItem w:displayText=".... College of Science (PFW) ...." w:value=".... College of Science (PFW) ...."/>
-          <w:listItem w:displayText="Department of Biological Sciences at Purdue Fort Wayne" w:value="Department of Biological Sciences at Purdue Fort Wayne"/>
-          <w:listItem w:displayText="Department of Chemistry and Biochemistry at Purdue Fort Wayne" w:value="Department of Chemistry and Biochemistry at Purdue Fort Wayne"/>
-          <w:listItem w:displayText="Department of Communication Sciences and Disorders at Purdue Fort Wayne" w:value="Department of Communication Sciences and Disorders at Purdue Fort Wayne"/>
-          <w:listItem w:displayText="Department of Mathematical Sciences at Purdue Fort Wayne" w:value="Department of Mathematical Sciences at Purdue Fort Wayne"/>
-          <w:listItem w:displayText="Department of Physics at Purdue Fort Wayne" w:value="Department of Physics at Purdue Fort Wayne"/>
-          <w:listItem w:displayText="Department of Psychology at Purdue Fort Wayne" w:value="Department of Psychology at Purdue Fort Wayne"/>
-          <w:listItem w:displayText=".... College of Visual and Performing Arts ...." w:value=".... College of Visual and Performing Arts ...."/>
-          <w:listItem w:displayText="Department of Art and Design at Purdue Fort Wayne" w:value="Department of Art and Design at Purdue Fort Wayne"/>
-          <w:listItem w:displayText="School of Music at Purdue Fort Wayne" w:value="School of Music at Purdue Fort Wayne"/>
-          <w:listItem w:displayText="Department of Theatre at Purdue Fort Wayne" w:value="Department of Theatre at Purdue Fort Wayne"/>
-          <w:listItem w:displayText=" --- PURDUE WEST LAFAYETTE AND INDIANAPOLIS---" w:value=" --- PURDUE WEST LAFAYETTE AND INDIANAPOLIS---"/>
-          <w:listItem w:displayText=".... College of Agriculture ...." w:value=".... College of Agriculture ...."/>
-          <w:listItem w:displayText="Department of Agricultural and Biological Engineering" w:value="Department of Agricultural and Biological Engineering"/>
-          <w:listItem w:displayText="Department of Agricultural Economics" w:value="Department of Agricultural Economics"/>
-          <w:listItem w:displayText="Department of Agricultural Sciences Education and Communication" w:value="Department of Agricultural Sciences Education and Communication"/>
-          <w:listItem w:displayText="Department of Agronomy" w:value="Department of Agronomy"/>
-          <w:listItem w:displayText="Department of Animal Sciences" w:value="Department of Animal Sciences"/>
-          <w:listItem w:displayText="Department of Biochemistry" w:value="Department of Biochemistry"/>
-          <w:listItem w:displayText="Department of Botany and Plant Pathology" w:value="Department of Botany and Plant Pathology"/>
-          <w:listItem w:displayText="Department of Entomology" w:value="Department of Entomology"/>
-          <w:listItem w:displayText="Department of Food Science" w:value="Department of Food Science"/>
-          <w:listItem w:displayText="Department of Forestry and Natural Resources" w:value="Department of Forestry and Natural Resources"/>
-          <w:listItem w:displayText="Department of Horticulture &amp; Landscape Architecture" w:value="Department of Horticulture &amp; Landscape Architecture"/>
-          <w:listItem w:displayText="....College of Education...." w:value="....College of Education...."/>
-          <w:listItem w:displayText="Department of Curriculum and Instruction" w:value="Department of Curriculum and Instruction"/>
-          <w:listItem w:displayText="Department of Educational Studies" w:value="Department of Educational Studies"/>
-          <w:listItem w:displayText="....College of Engineering...." w:value="....College of Engineering...."/>
-          <w:listItem w:displayText="Department of Aeronautics and Astronautics" w:value="Department of Aeronautics and Astronautics"/>
-          <w:listItem w:displayText="Department of Agricultural &amp; Biological Engineering" w:value="Department of Agricultural &amp; Biological Engineering"/>
-          <w:listItem w:displayText="Weldon School of Biomedical Engineering" w:value="Weldon School of Biomedical Engineering"/>
-          <w:listItem w:displayText="Davidson School of Chemical Engineering" w:value="Davidson School of Chemical Engineering"/>
-          <w:listItem w:displayText="Lyles School of Civil &amp; Construction Engineering" w:value="Lyles School of Civil &amp; Construction Engineering"/>
-          <w:listItem w:displayText="Department of Computer Science (College of Engineering)" w:value="Department of Computer Science (College of Engineering)"/>
-          <w:listItem w:displayText="Elmore Family School of Electrical and Computer Engineering" w:value="Elmore Family School of Electrical and Computer Engineering"/>
-          <w:listItem w:displayText="Department of Engineering Education" w:value="Department of Engineering Education"/>
-          <w:listItem w:displayText="Edwardson School of Industrial Engineering" w:value="Edwardson School of Industrial Engineering"/>
-          <w:listItem w:displayText="Department of Materials Engineering" w:value="Department of Materials Engineering"/>
-          <w:listItem w:displayText="Department of Mechanical Engineering" w:value="Department of Mechanical Engineering"/>
-          <w:listItem w:displayText="Department of Nuclear Engineering" w:value="Department of Nuclear Engineering"/>
-          <w:listItem w:displayText="Department of Sustainability Engineering and Environmental Engineering" w:value="Department of Sustainability Engineering and Environmental Engineering"/>
-          <w:listItem w:displayText="....College of Health and Human Sciences...." w:value="....College of Health and Human Sciences...."/>
-          <w:listItem w:displayText="Department of Health and Kinesiology" w:value="Department of Health and Kinesiology"/>
-          <w:listItem w:displayText="Department of Health Sciences" w:value="Department of Health Sciences"/>
-          <w:listItem w:displayText="Department of Hospitality and Tourism Management" w:value="Department of Hospitality and Tourism Management"/>
-          <w:listItem w:displayText="Department of Human Development &amp; Family Science" w:value="Department of Human Development &amp; Family Science"/>
-          <w:listItem w:displayText="Department of Nursing" w:value="Department of Nursing"/>
-          <w:listItem w:displayText="Department of Nutrition Science" w:value="Department of Nutrition Science"/>
-          <w:listItem w:displayText="Department of Psychological Sciences" w:value="Department of Psychological Sciences"/>
-          <w:listItem w:displayText="Department of Public Health" w:value="Department of Public Health"/>
-          <w:listItem w:displayText="Department of Speech, Language, &amp; Hearing Sciences" w:value="Department of Speech, Language, &amp; Hearing Sciences"/>
-          <w:listItem w:displayText=".... College of Liberal Arts ...." w:value=".... College of Liberal Arts ...."/>
-          <w:listItem w:displayText="Department of Anthropology" w:value="Department of Anthropology"/>
-          <w:listItem w:displayText="Brian Lamb School of Communication" w:value="Brian Lamb School of Communication"/>
-          <w:listItem w:displayText="Department of English" w:value="Department of English"/>
-          <w:listItem w:displayText="Department of History" w:value="Department of History"/>
-          <w:listItem w:displayText="Department of Philosophy" w:value="Department of Philosophy"/>
-          <w:listItem w:displayText="Department of Political Science" w:value="Department of Political Science"/>
-          <w:listItem w:displayText="Patti &amp; Rusty Rueff School of Design, Art, and Performance" w:value="Patti &amp; Rusty Rueff School of Design, Art, and Performance"/>
-          <w:listItem w:displayText="School of Interdisciplinary Studies" w:value="School of Interdisciplinary Studies"/>
-          <w:listItem w:displayText="School of Languages and Cultures" w:value="School of Languages and Cultures"/>
-          <w:listItem w:displayText="Department of Sociology" w:value="Department of Sociology"/>
-          <w:listItem w:displayText=".... Mitch Daniels School of Business ...." w:value=".... Mitch Daniels School of Business ...."/>
-          <w:listItem w:displayText="Department of Accounting" w:value="Department of Accounting"/>
-          <w:listItem w:displayText="Department of Economics" w:value="Department of Economics"/>
-          <w:listItem w:displayText="Department of Finance" w:value="Department of Finance"/>
-          <w:listItem w:displayText="Department of Management Information Systems" w:value="Department of Management Information Systems"/>
-          <w:listItem w:displayText="Department of Marketing" w:value="Department of Marketing"/>
-          <w:listItem w:displayText="Department of Organizational Behavior and Human Resources" w:value="Department of Organizational Behavior and Human Resources"/>
-          <w:listItem w:displayText="Department of Quantitative Methods" w:value="Department of Quantitative Methods"/>
-          <w:listItem w:displayText="Department of Strategic Management" w:value="Department of Strategic Management"/>
-          <w:listItem w:displayText="Department of Supply Chain and Operations Management" w:value="Department of Supply Chain and Operations Management"/>
-          <w:listItem w:displayText=".... College of Pharmacy ...." w:value=".... College of Pharmacy ...."/>
-          <w:listItem w:displayText="Department of Pharmacy Practice" w:value="Department of Pharmacy Practice"/>
-          <w:listItem w:displayText="Department of Industrial and Molecular Pharmaceutics" w:value="Department of Industrial and Molecular Pharmaceutics"/>
-          <w:listItem w:displayText="Borch Department of Medicinal Chemistry and Molecular Pharmacology" w:value="Borch Department of Medicinal Chemistry and Molecular Pharmacology"/>
-          <w:listItem w:displayText="....Purdue Polytechnic Institute...." w:value="....Purdue Polytechnic Institute...."/>
-          <w:listItem w:displayText="School of Applied and Creative Computing" w:value="School of Applied and Creative Computing"/>
-          <w:listItem w:displayText="School of Aviation and Transportation Technology" w:value="School of Aviation and Transportation Technology"/>
-          <w:listItem w:displayText="Bowen School of Construction" w:value="Bowen School of Construction"/>
-          <w:listItem w:displayText="School of Engineering Technology" w:value="School of Engineering Technology"/>
-          <w:listItem w:displayText="Department of Technology Leadership and Innovation" w:value="Department of Technology Leadership and Innovation"/>
-          <w:listItem w:displayText=".... College of Science ...." w:value=".... College of Science ...."/>
-          <w:listItem w:displayText="Department of Biological Sciences" w:value="Department of Biological Sciences"/>
-          <w:listItem w:displayText="James Tarpo Jr. and Margaret Tarpo Department of Chemistry" w:value="James Tarpo Jr. and Margaret Tarpo Department of Chemistry"/>
-          <w:listItem w:displayText="Department of Computer Science (College of Science)" w:value="Department of Computer Science (College of Science)"/>
-          <w:listItem w:displayText="Department of Earth, Atmospheric, and Planetary Sciences" w:value="Department of Earth, Atmospheric, and Planetary Sciences"/>
-          <w:listItem w:displayText="Department of Mathematics" w:value="Department of Mathematics"/>
-          <w:listItem w:displayText="Department of Physics and Astronomy" w:value="Department of Physics and Astronomy"/>
-          <w:listItem w:displayText="Department of Statistics" w:value="Department of Statistics"/>
-          <w:listItem w:displayText=".... College of Veterinary Medicine ...." w:value=".... College of Veterinary Medicine ...."/>
-          <w:listItem w:displayText="Department of Basic Medical Sciences" w:value="Department of Basic Medical Sciences"/>
-          <w:listItem w:displayText="Department of Comparative Pathobiology" w:value="Department of Comparative Pathobiology"/>
-          <w:listItem w:displayText="Department of Veterinary Clinical Sciences" w:value="Department of Veterinary Clinical Sciences"/>
-        </w:comboBox>
-      </w:sdtPr>
-      <w:sdtEndPr/>
-      <w:sdtContent>
-        <w:p>
-          <w:pPr>
-            <w:spacing w:after="240"/>
-            <w:jc w:val="center"/>
-            <w:rPr>
-              <w:rFonts w:cs="Times New Roman"/>
-            </w:rPr>
-          </w:pPr>
-          <w:r>
-            <w:rPr>
-              <w:rFonts w:cs="Times New Roman"/>
-            </w:rPr>
-            <w:t>Choose Department</w:t>
-          </w:r>
-        </w:p>
-      </w:sdtContent>
-    </w:sdt>
-    <w:p>
-      <w:pPr>
-        <w:jc w:val="center"/>
-        <w:rPr>
-          <w:rFonts w:cs="Times New Roman"/>
-          <w:b/>
-        </w:rPr>
-      </w:pPr>
-      <w:sdt>
-        <w:sdtPr>
-          <w:rPr>
-            <w:rFonts w:cs="Times New Roman"/>
-          </w:rPr>
-          <w:id w:val="1448739758"/>
-          <w:placeholder>
-            <w:docPart w:val="4616038E18C3477CBE20FAF95E27F6BB"/>
-          </w:placeholder>
-          <w15:appearance w15:val="hidden"/>
-        </w:sdtPr>
-        <w:sdtEndPr>
-          <w:rPr>
-            <w:b/>
-          </w:rPr>
-        </w:sdtEndPr>
-        <w:sdtContent>
-          <w:r>
-            <w:rPr>
-              <w:rFonts w:cs="Times New Roman"/>
-              <w:b/>
-              <w:bCs/>
-            </w:rPr>
-            <w:t xml:space="preserve">Prof. </w:t>
-          </w:r>
-          <w:r>
-            <w:rPr>
-              <w:rFonts w:cs="Times New Roman"/>
-              <w:b/>
-            </w:rPr>
-            <w:t xml:space="preserve">Add or Delete Committee Member, </w:t>
-          </w:r>
-        </w:sdtContent>
-      </w:sdt>
-      <w:r>
-        <w:rPr>
-          <w:rFonts w:cs="Times New Roman"/>
-          <w:b/>
-        </w:rPr>
-        <w:t>Member</w:t>
-      </w:r>
-    </w:p>
-    <w:sdt>
-      <w:sdtPr>
-        <w:rPr>
-          <w:rFonts w:cs="Times New Roman"/>
-        </w:rPr>
-        <w:alias w:val="Choose Department"/>
-        <w:tag w:val="Choose Department"/>
-        <w:id w:val="-1713573871"/>
-        <w:placeholder>
-          <w:docPart w:val="3B83BE829EED4FC3B7AD2560BC6FB9A1"/>
-        </w:placeholder>
-        <w:comboBox>
-          <w:listItem w:displayText="Choose Department" w:value="Choose Department"/>
-          <w:listItem w:displayText="**For committee members external to Purdue, you must manually type the organization name**" w:value="**For committee members external to Purdue, you must manually type the organization name**"/>
-          <w:listItem w:displayText="--- IU INDIANAPOLIS ---" w:value="--- IU INDIANAPOLIS ---"/>
-          <w:listItem w:displayText="Department of Biology" w:value="Department of Biology"/>
-          <w:listItem w:displayText="Department of Chemistry and Chemical Biology " w:value="Department of Chemistry and Chemical Biology "/>
-          <w:listItem w:displayText="Department of Computer and Information Science" w:value="Department of Computer and Information Science"/>
-          <w:listItem w:displayText="Department of Mathematical Sciences" w:value="Department of Mathematical Sciences"/>
-          <w:listItem w:displayText="Department of Physics" w:value="Department of Physics"/>
-          <w:listItem w:displayText="--- PURDUE NORTHWEST ---" w:value="--- PURDUE NORTHWEST ---"/>
-          <w:listItem w:displayText="College of Business at Purdue Northwest" w:value="College of Business at Purdue Northwest"/>
-          <w:listItem w:displayText="College of Engineering and Sciences at Purdue Northwest" w:value="College of Engineering and Sciences at Purdue Northwest"/>
-          <w:listItem w:displayText="College of Humanities, Education, and Social Sciences at Purdue Northwest" w:value="College of Humanities, Education, and Social Sciences at Purdue Northwest"/>
-          <w:listItem w:displayText="College of Nursing at Purdue Northwest" w:value="College of Nursing at Purdue Northwest"/>
-          <w:listItem w:displayText="College of Technology at Purdue Northwest" w:value="College of Technology at Purdue Northwest"/>
-          <w:listItem w:displayText="School of Education and Counseling" w:value="School of Education and Counseling"/>
-          <w:listItem w:displayText="School of Engineering" w:value="School of Engineering"/>
-          <w:listItem w:displayText="White Lodging School of Hospitality and Tourism Management at Purdue Northwest" w:value="White Lodging School of Hospitality and Tourism Management at Purdue Northwest"/>
-          <w:listItem w:displayText="--- PURDUE FORT WAYNE ---" w:value="--- PURDUE FORT WAYNE ---"/>
-          <w:listItem w:displayText=".... Doermer School of Business ...." w:value=".... Doermer School of Business ...."/>
-          <w:listItem w:displayText="Department of Accounting at Purdue Fort Wayne" w:value="Department of Accounting at Purdue Fort Wayne"/>
-          <w:listItem w:displayText="Department of Economics and Finance" w:value="Department of Economics and Finance"/>
-          <w:listItem w:displayText="Department of Hospitality and Tourism Management at Purdue Fort Wayne" w:value="Department of Hospitality and Tourism Management at Purdue Fort Wayne"/>
-          <w:listItem w:displayText="Department of Management and Marketing at Purdue Fort Wayne" w:value="Department of Management and Marketing at Purdue Fort Wayne"/>
-          <w:listItem w:displayText=".... School of Education ...." w:value=".... School of Education ...."/>
-          <w:listItem w:displayText="Department of Counseling and Graduate Education at Purdue Fort Wayne" w:value="Department of Counseling and Graduate Education at Purdue Fort Wayne"/>
-          <w:listItem w:displayText="Department of Human Services at Purdue Fort Wayne" w:value="Department of Human Services at Purdue Fort Wayne"/>
-          <w:listItem w:displayText="Department of Teacher Education at Purdue Fort Wayne" w:value="Department of Teacher Education at Purdue Fort Wayne"/>
-          <w:listItem w:displayText=".... College of Engineering, Technology, and Computer Science ...." w:value=".... College of Engineering, Technology, and Computer Science ...."/>
-          <w:listItem w:displayText="Department of Civil and Mechanical Engineering at Purdue Fort Wayne" w:value="Department of Civil and Mechanical Engineering at Purdue Fort Wayne"/>
-          <w:listItem w:displayText="Department of Computer Science at Purdue Fort Wayne" w:value="Department of Computer Science at Purdue Fort Wayne"/>
-          <w:listItem w:displayText="Department of Electrical and Computer Engineering at Purdue Fort Wayne" w:value="Department of Electrical and Computer Engineering at Purdue Fort Wayne"/>
-          <w:listItem w:displayText="Department of Organizational Leadership at Purdue Fort Wayne" w:value="Department of Organizational Leadership at Purdue Fort Wayne"/>
-          <w:listItem w:displayText="School of Polytechnic at Purdue Fort Wayne" w:value="School of Polytechnic at Purdue Fort Wayne"/>
-          <w:listItem w:displayText=".... College of Liberal Arts (PFW)...." w:value=".... College of Liberal Arts (PFW)...."/>
-          <w:listItem w:displayText="Department of Anthropology and Sociology at Purdue Fort Wayne" w:value="Department of Anthropology and Sociology at Purdue Fort Wayne"/>
-          <w:listItem w:displayText="Department of Communication at Purdue Fort Wayne" w:value="Department of Communication at Purdue Fort Wayne"/>
-          <w:listItem w:displayText="Department of Criminal Justice at Purdue Fort Wayne" w:value="Department of Criminal Justice at Purdue Fort Wayne"/>
-          <w:listItem w:displayText="Department of English at Purdue Fort Wayne" w:value="Department of English at Purdue Fort Wayne"/>
-          <w:listItem w:displayText="Department of History at Purdue Fort Wayne" w:value="Department of History at Purdue Fort Wayne"/>
-          <w:listItem w:displayText="Department of Interdisciplinary Studies at Purdue Fort Wayne" w:value="Department of Interdisciplinary Studies at Purdue Fort Wayne"/>
-          <w:listItem w:displayText="Department of International Languages and Cultures at Purdue Fort Wayne" w:value="Department of International Languages and Cultures at Purdue Fort Wayne"/>
-          <w:listItem w:displayText="Department of Political Science at Purdue Fort Wayne" w:value="Department of Political Science at Purdue Fort Wayne"/>
-          <w:listItem w:displayText=".... College of Science (PFW) ...." w:value=".... College of Science (PFW) ...."/>
-          <w:listItem w:displayText="Department of Biological Sciences at Purdue Fort Wayne" w:value="Department of Biological Sciences at Purdue Fort Wayne"/>
-          <w:listItem w:displayText="Department of Chemistry and Biochemistry at Purdue Fort Wayne" w:value="Department of Chemistry and Biochemistry at Purdue Fort Wayne"/>
-          <w:listItem w:displayText="Department of Communication Sciences and Disorders at Purdue Fort Wayne" w:value="Department of Communication Sciences and Disorders at Purdue Fort Wayne"/>
-          <w:listItem w:displayText="Department of Mathematical Sciences at Purdue Fort Wayne" w:value="Department of Mathematical Sciences at Purdue Fort Wayne"/>
-          <w:listItem w:displayText="Department of Physics at Purdue Fort Wayne" w:value="Department of Physics at Purdue Fort Wayne"/>
-          <w:listItem w:displayText="Department of Psychology at Purdue Fort Wayne" w:value="Department of Psychology at Purdue Fort Wayne"/>
-          <w:listItem w:displayText=".... College of Visual and Performing Arts ...." w:value=".... College of Visual and Performing Arts ...."/>
-          <w:listItem w:displayText="Department of Art and Design at Purdue Fort Wayne" w:value="Department of Art and Design at Purdue Fort Wayne"/>
-          <w:listItem w:displayText="School of Music at Purdue Fort Wayne" w:value="School of Music at Purdue Fort Wayne"/>
-          <w:listItem w:displayText="Department of Theatre at Purdue Fort Wayne" w:value="Department of Theatre at Purdue Fort Wayne"/>
-          <w:listItem w:displayText=" --- PURDUE WEST LAFAYETTE AND INDIANAPOLIS---" w:value=" --- PURDUE WEST LAFAYETTE AND INDIANAPOLIS---"/>
-          <w:listItem w:displayText=".... College of Agriculture ...." w:value=".... College of Agriculture ...."/>
-          <w:listItem w:displayText="Department of Agricultural and Biological Engineering" w:value="Department of Agricultural and Biological Engineering"/>
-          <w:listItem w:displayText="Department of Agricultural Economics" w:value="Department of Agricultural Economics"/>
-          <w:listItem w:displayText="Department of Agricultural Sciences Education and Communication" w:value="Department of Agricultural Sciences Education and Communication"/>
-          <w:listItem w:displayText="Department of Agronomy" w:value="Department of Agronomy"/>
-          <w:listItem w:displayText="Department of Animal Sciences" w:value="Department of Animal Sciences"/>
-          <w:listItem w:displayText="Department of Biochemistry" w:value="Department of Biochemistry"/>
-          <w:listItem w:displayText="Department of Botany and Plant Pathology" w:value="Department of Botany and Plant Pathology"/>
-          <w:listItem w:displayText="Department of Entomology" w:value="Department of Entomology"/>
-          <w:listItem w:displayText="Department of Food Science" w:value="Department of Food Science"/>
-          <w:listItem w:displayText="Department of Forestry and Natural Resources" w:value="Department of Forestry and Natural Resources"/>
-          <w:listItem w:displayText="Department of Horticulture &amp; Landscape Architecture" w:value="Department of Horticulture &amp; Landscape Architecture"/>
-          <w:listItem w:displayText="....College of Education...." w:value="....College of Education...."/>
-          <w:listItem w:displayText="Department of Curriculum and Instruction" w:value="Department of Curriculum and Instruction"/>
-          <w:listItem w:displayText="Department of Educational Studies" w:value="Department of Educational Studies"/>
-          <w:listItem w:displayText="....College of Engineering...." w:value="....College of Engineering...."/>
-          <w:listItem w:displayText="Department of Aeronautics and Astronautics" w:value="Department of Aeronautics and Astronautics"/>
-          <w:listItem w:displayText="Department of Agricultural &amp; Biological Engineering" w:value="Department of Agricultural &amp; Biological Engineering"/>
-          <w:listItem w:displayText="Weldon School of Biomedical Engineering" w:value="Weldon School of Biomedical Engineering"/>
-          <w:listItem w:displayText="Davidson School of Chemical Engineering" w:value="Davidson School of Chemical Engineering"/>
-          <w:listItem w:displayText="Lyles School of Civil &amp; Construction Engineering" w:value="Lyles School of Civil &amp; Construction Engineering"/>
-          <w:listItem w:displayText="Department of Computer Science (College of Engineering)" w:value="Department of Computer Science (College of Engineering)"/>
-          <w:listItem w:displayText="Elmore Family School of Electrical and Computer Engineering" w:value="Elmore Family School of Electrical and Computer Engineering"/>
-          <w:listItem w:displayText="Department of Engineering Education" w:value="Department of Engineering Education"/>
-          <w:listItem w:displayText="Edwardson School of Industrial Engineering" w:value="Edwardson School of Industrial Engineering"/>
-          <w:listItem w:displayText="Department of Materials Engineering" w:value="Department of Materials Engineering"/>
-          <w:listItem w:displayText="Department of Mechanical Engineering" w:value="Department of Mechanical Engineering"/>
-          <w:listItem w:displayText="Department of Nuclear Engineering" w:value="Department of Nuclear Engineering"/>
-          <w:listItem w:displayText="Department of Sustainability Engineering and Environmental Engineering" w:value="Department of Sustainability Engineering and Environmental Engineering"/>
-          <w:listItem w:displayText="....College of Health and Human Sciences...." w:value="....College of Health and Human Sciences...."/>
-          <w:listItem w:displayText="Department of Health and Kinesiology" w:value="Department of Health and Kinesiology"/>
-          <w:listItem w:displayText="Department of Health Sciences" w:value="Department of Health Sciences"/>
-          <w:listItem w:displayText="Department of Hospitality and Tourism Management" w:value="Department of Hospitality and Tourism Management"/>
-          <w:listItem w:displayText="Department of Human Development &amp; Family Science" w:value="Department of Human Development &amp; Family Science"/>
-          <w:listItem w:displayText="Department of Nursing" w:value="Department of Nursing"/>
-          <w:listItem w:displayText="Department of Nutrition Science" w:value="Department of Nutrition Science"/>
-          <w:listItem w:displayText="Department of Psychological Sciences" w:value="Department of Psychological Sciences"/>
-          <w:listItem w:displayText="Department of Public Health" w:value="Department of Public Health"/>
-          <w:listItem w:displayText="Department of Speech, Language, &amp; Hearing Sciences" w:value="Department of Speech, Language, &amp; Hearing Sciences"/>
-          <w:listItem w:displayText=".... College of Liberal Arts ...." w:value=".... College of Liberal Arts ...."/>
-          <w:listItem w:displayText="Department of Anthropology" w:value="Department of Anthropology"/>
-          <w:listItem w:displayText="Brian Lamb School of Communication" w:value="Brian Lamb School of Communication"/>
-          <w:listItem w:displayText="Department of English" w:value="Department of English"/>
-          <w:listItem w:displayText="Department of History" w:value="Department of History"/>
-          <w:listItem w:displayText="Department of Philosophy" w:value="Department of Philosophy"/>
-          <w:listItem w:displayText="Department of Political Science" w:value="Department of Political Science"/>
-          <w:listItem w:displayText="Patti &amp; Rusty Rueff School of Design, Art, and Performance" w:value="Patti &amp; Rusty Rueff School of Design, Art, and Performance"/>
-          <w:listItem w:displayText="School of Interdisciplinary Studies" w:value="School of Interdisciplinary Studies"/>
-          <w:listItem w:displayText="School of Languages and Cultures" w:value="School of Languages and Cultures"/>
-          <w:listItem w:displayText="Department of Sociology" w:value="Department of Sociology"/>
-          <w:listItem w:displayText=".... Mitch Daniels School of Business ...." w:value=".... Mitch Daniels School of Business ...."/>
-          <w:listItem w:displayText="Department of Accounting" w:value="Department of Accounting"/>
-          <w:listItem w:displayText="Department of Economics" w:value="Department of Economics"/>
-          <w:listItem w:displayText="Department of Finance" w:value="Department of Finance"/>
-          <w:listItem w:displayText="Department of Management Information Systems" w:value="Department of Management Information Systems"/>
-          <w:listItem w:displayText="Department of Marketing" w:value="Department of Marketing"/>
-          <w:listItem w:displayText="Department of Organizational Behavior and Human Resources" w:value="Department of Organizational Behavior and Human Resources"/>
-          <w:listItem w:displayText="Department of Quantitative Methods" w:value="Department of Quantitative Methods"/>
-          <w:listItem w:displayText="Department of Strategic Management" w:value="Department of Strategic Management"/>
-          <w:listItem w:displayText="Department of Supply Chain and Operations Management" w:value="Department of Supply Chain and Operations Management"/>
-          <w:listItem w:displayText=".... College of Pharmacy ...." w:value=".... College of Pharmacy ...."/>
-          <w:listItem w:displayText="Department of Pharmacy Practice" w:value="Department of Pharmacy Practice"/>
-          <w:listItem w:displayText="Department of Industrial and Molecular Pharmaceutics" w:value="Department of Industrial and Molecular Pharmaceutics"/>
-          <w:listItem w:displayText="Borch Department of Medicinal Chemistry and Molecular Pharmacology" w:value="Borch Department of Medicinal Chemistry and Molecular Pharmacology"/>
-          <w:listItem w:displayText="....Purdue Polytechnic Institute...." w:value="....Purdue Polytechnic Institute...."/>
-          <w:listItem w:displayText="School of Applied and Creative Computing" w:value="School of Applied and Creative Computing"/>
-          <w:listItem w:displayText="School of Aviation and Transportation Technology" w:value="School of Aviation and Transportation Technology"/>
-          <w:listItem w:displayText="Bowen School of Construction" w:value="Bowen School of Construction"/>
-          <w:listItem w:displayText="School of Engineering Technology" w:value="School of Engineering Technology"/>
-          <w:listItem w:displayText="Department of Technology Leadership and Innovation" w:value="Department of Technology Leadership and Innovation"/>
-          <w:listItem w:displayText=".... College of Science ...." w:value=".... College of Science ...."/>
-          <w:listItem w:displayText="Department of Biological Sciences" w:value="Department of Biological Sciences"/>
-          <w:listItem w:displayText="James Tarpo Jr. and Margaret Tarpo Department of Chemistry" w:value="James Tarpo Jr. and Margaret Tarpo Department of Chemistry"/>
-          <w:listItem w:displayText="Department of Computer Science (College of Science)" w:value="Department of Computer Science (College of Science)"/>
-          <w:listItem w:displayText="Department of Earth, Atmospheric, and Planetary Sciences" w:value="Department of Earth, Atmospheric, and Planetary Sciences"/>
-          <w:listItem w:displayText="Department of Mathematics" w:value="Department of Mathematics"/>
-          <w:listItem w:displayText="Department of Physics and Astronomy" w:value="Department of Physics and Astronomy"/>
-          <w:listItem w:displayText="Department of Statistics" w:value="Department of Statistics"/>
-          <w:listItem w:displayText=".... College of Veterinary Medicine ...." w:value=".... College of Veterinary Medicine ...."/>
-          <w:listItem w:displayText="Department of Basic Medical Sciences" w:value="Department of Basic Medical Sciences"/>
-          <w:listItem w:displayText="Department of Comparative Pathobiology" w:value="Department of Comparative Pathobiology"/>
-          <w:listItem w:displayText="Department of Veterinary Clinical Sciences" w:value="Department of Veterinary Clinical Sciences"/>
-        </w:comboBox>
-      </w:sdtPr>
-      <w:sdtEndPr/>
-      <w:sdtContent>
-        <w:p>
-          <w:pPr>
-            <w:spacing w:after="240"/>
-            <w:jc w:val="center"/>
-            <w:rPr>
-              <w:rFonts w:cs="Times New Roman"/>
-            </w:rPr>
-          </w:pPr>
-          <w:r>
-            <w:rPr>
-              <w:rFonts w:cs="Times New Roman"/>
-            </w:rPr>
-            <w:t>Choose Department</w:t>
+            <w:t xml:space="preserve">School of Applied and Creative Computing</w:t>
           </w:r>
         </w:p>
       </w:sdtContent>
@@ -1813,13 +1369,13 @@
         <w:rPr>
           <w:rFonts w:cs="Times New Roman"/>
         </w:rPr>
-        <w:t xml:space="preserve">Dr. </w:t>
+        <w:t xml:space="preserve">Dr. Chad Laux</w:t>
       </w:r>
       <w:r>
         <w:rPr>
           <w:rFonts w:cs="Times New Roman"/>
         </w:rPr>
-        <w:t>Type the program’s Thesis Form Head name here</w:t>
+        <w:t/>
       </w:r>
     </w:p>
     <w:p>
@@ -1862,77 +1418,77 @@
           <w:i/>
         </w:rPr>
         <w:lastRenderedPageBreak/>
-        <w:t xml:space="preserve">Dedicated to my </w:t>
+        <w:t xml:space="preserve">To my parents for their endless sacrifices, love, and belief in me, and to my friends and mentors for their constant support and guidance.</w:t>
       </w:r>
       <w:r>
         <w:rPr>
           <w:rFonts w:cs="Arial"/>
           <w:i/>
         </w:rPr>
-        <w:t>f</w:t>
+        <w:t/>
       </w:r>
       <w:r>
         <w:rPr>
           <w:rFonts w:cs="Arial"/>
           <w:i/>
         </w:rPr>
-        <w:t xml:space="preserve">amily, </w:t>
+        <w:t xml:space="preserve"/>
       </w:r>
       <w:r>
         <w:rPr>
           <w:rFonts w:cs="Arial"/>
           <w:i/>
         </w:rPr>
-        <w:t>t</w:t>
+        <w:t/>
       </w:r>
       <w:r>
         <w:rPr>
           <w:rFonts w:cs="Arial"/>
           <w:i/>
         </w:rPr>
-        <w:t>eachers</w:t>
+        <w:t/>
       </w:r>
       <w:r>
         <w:rPr>
           <w:rFonts w:cs="Arial"/>
           <w:i/>
         </w:rPr>
-        <w:t>,</w:t>
+        <w:t/>
       </w:r>
       <w:r>
         <w:rPr>
           <w:rFonts w:cs="Arial"/>
           <w:i/>
         </w:rPr>
-        <w:t xml:space="preserve"> </w:t>
+        <w:t xml:space="preserve"/>
       </w:r>
       <w:r>
         <w:rPr>
           <w:rFonts w:cs="Arial"/>
           <w:i/>
         </w:rPr>
-        <w:t>and</w:t>
+        <w:t/>
       </w:r>
       <w:r>
         <w:rPr>
           <w:rFonts w:cs="Arial"/>
           <w:i/>
         </w:rPr>
-        <w:t xml:space="preserve"> </w:t>
+        <w:t xml:space="preserve"/>
       </w:r>
       <w:r>
         <w:rPr>
           <w:rFonts w:cs="Arial"/>
           <w:i/>
         </w:rPr>
-        <w:t>f</w:t>
+        <w:t/>
       </w:r>
       <w:r>
         <w:rPr>
           <w:rFonts w:cs="Arial"/>
           <w:i/>
         </w:rPr>
-        <w:t>riends</w:t>
+        <w:t/>
       </w:r>
     </w:p>
     <w:p>
@@ -1974,21 +1530,21 @@
         </w:rPr>
       </w:pPr>
       <w:r>
-        <w:t xml:space="preserve">This page is OPTIONAL. The acknowledgements section is typically reserved for professional </w:t>
+        <w:t xml:space="preserve">I would like to express my deepest gratitude to my advisor, Dr. Chad Laux, for his unwavering guidance, mentorship, and constructive feedback throughout the course of this research. His expertise, encouragement, and genuine commitment to my growth provided a strong foundation for this work. Beyond academic support, he offered me opportunities I could never have imagined, which profoundly shaped my professional development and broadened my perspective as a researcher. I am also sincerely thankful to Dr. Tawfiq Salem for his guidance, trust, and continued collaboration. His confidence in my abilities, thoughtful insights, and willingness to work closely with me were instrumental in strengthening both this research and my personal growth.</w:t>
       </w:r>
       <w:proofErr w:type="gramStart"/>
       <w:r>
-        <w:t>dedications</w:t>
+        <w:t/>
       </w:r>
       <w:proofErr w:type="gramEnd"/>
       <w:r>
-        <w:t>. You may also include funding information or any other copyright acknowledgments. If you do not intend to professionally dedicate this document</w:t>
+        <w:t/>
       </w:r>
       <w:r>
         <w:rPr>
           <w:iCs/>
         </w:rPr>
-        <w:t xml:space="preserve"> to anyone, delete this page.</w:t>
+        <w:t xml:space="preserve"/>
       </w:r>
       <w:r>
         <w:rPr>
@@ -1996,6 +1552,19 @@
         </w:rPr>
         <w:br w:type="page"/>
       </w:r>
+    </w:p>
+    <w:p>
+      <w:pPr>
+        <w:pStyle w:val="IndentedParagraph"/>
+        <w:rPr>
+          <w:iCs/>
+        </w:rPr>
+      </w:pPr>
+      <w:r>
+        <w:t xml:space="preserve">I am deeply grateful for their collective support, dedication, and belief in me. Their mentorship played a vital role in the successful completion of this thesis and has left a lasting impact on my academic and professional journey.</w:t>
+      </w:r>
+      <w:proofErr w:type="gramStart"/>
+      <w:proofErr w:type="gramEnd"/>
     </w:p>
     <w:p>
       <w:pPr>
@@ -5367,7 +4936,47 @@
         <w:pStyle w:val="IndentedParagraph"/>
       </w:pPr>
       <w:r>
-        <w:t>Paragraph starts here</w:t>
+        <w:t xml:space="preserve">Fine particulate matter with an aerodynamic diameter less than 2.5 micrometers (PM₂.₅) is among the most harmful air pollutants due to its ability to penetrate deep into the respiratory system and enter the bloodstream. Long term exposure to elevated PM₂.₅ concentrations has been strongly associated with respiratory and cardiovascular diseases, premature mortality and reduced quality of life. As urbanization and industrial activity continue to intensify worldwide, the ability to monitor and manage PM₂.₅ levels has become a critical component of environmental sustainability, public health protection and sustainable urban development, supporting long-term strategies aimed at reducing population exposure and improving overall well-being.</w:t>
+      </w:r>
+    </w:p>
+    <w:p>
+      <w:pPr>
+        <w:pStyle w:val="IndentedParagraph"/>
+      </w:pPr>
+      <w:r>
+        <w:t xml:space="preserve">Conventional air quality monitoring systems rely primarily on ground-based sensor networks that provide accurate measurements at fixed locations. While these stations offer reliable point level observations, they are often sparsely distributed, unevenly located and costly to deploy, operate and maintain. As a result, large geographic regions particularly in rapidly urbanizing areas and low and middle-income regions lack sufficient monitoring coverage, limiting the sustainability of long-term air quality management efforts and constraining data driven environmental planning and policy evaluation.</w:t>
+      </w:r>
+    </w:p>
+    <w:p>
+      <w:pPr>
+        <w:pStyle w:val="IndentedParagraph"/>
+      </w:pPr>
+      <w:r>
+        <w:t xml:space="preserve">Satellite remote sensing has emerged as a valuable complement to ground-based monitoring by offering consistent observations over broad spatial extents. Many existing satellite-based approaches for estimating PM₂.₅ concentrations rely on aerosol optical depth (AOD) products and their integration with meteorological variables and chemical transport models. Although these methods have demonstrated effectiveness at regional and global scales, they often face challenges related to cloud contamination, uncertainties in vertical aerosol distribution and relatively coarse spatial resolution. These limitations can restrict their application for localized air quality assessment and sustainability-focused urban analysis, where fine-scale spatial detail is essential.</w:t>
+      </w:r>
+    </w:p>
+    <w:p>
+      <w:pPr>
+        <w:pStyle w:val="IndentedParagraph"/>
+      </w:pPr>
+      <w:r>
+        <w:t xml:space="preserve">Recent advances in high-resolution Earth observation have opened new opportunities for data-driven air quality monitoring. The Sentinel-2 satellite constellation provides optical imagery at spatial resolutions as fine as 10 meters, capturing detailed information about land cover, urban structure and surface reflectance. Such surface characteristics are closely linked to emission sources, dispersion patterns and human activity and therefore serve as indirect indicators of PM₂.₅ variability. In addition, when the imagery is used before atmospheric correction, it also records the haze and smoke present in the air above the surface, which is a direct visual signature of particulate pollution. Because Sentinel-2 imagery is free and covers the whole globe, it is a promising data source for estimating PM₂.₅ in places where no monitor exists.</w:t>
+      </w:r>
+    </w:p>
+    <w:p>
+      <w:pPr>
+        <w:pStyle w:val="IndentedParagraph"/>
+      </w:pPr>
+      <w:r>
+        <w:t xml:space="preserve">In this thesis, I investigate how accurately PM₂.₅ can be estimated from Sentinel-2 imagery at locations that have no ground monitor. I pair every usable Sentinel-2 pass over 199 EPA reference monitoring stations in five U.S. states, from 2020 to 2025, with the PM₂.₅ concentration measured at the station within one hour of the satellite overpass. A convolutional neural network is trained end to end on these pairs of images and measurements, and it is then combined with spatial, temporal and meteorological context that is available for any point on Earth without ground instruments. All results are reported at monitoring stations that were never seen during training, because this is the condition under which such a model would actually be used.</w:t>
+      </w:r>
+    </w:p>
+    <w:p>
+      <w:pPr>
+        <w:pStyle w:val="IndentedParagraph"/>
+      </w:pPr>
+      <w:r>
+        <w:t xml:space="preserve">The approach that I originally proposed used atmospherically corrected weekly composite images, weekly averaged PM₂.₅ labels and a pretrained network with frozen weights. When I evaluated it at unseen stations, it did not produce any signal that transferred to them. A large part of this work was therefore spent on understanding why, and the final design differs from the proposal in the imagery product, in how the labels are matched to the images in time, in how the network is trained and in how the context is fused with the image. These changes are described and justified in Chapter 3.</w:t>
       </w:r>
     </w:p>
     <w:p>
@@ -5380,7 +4989,7 @@
       <w:bookmarkStart w:id="58" w:name="_Toc226371102"/>
       <w:bookmarkStart w:id="59" w:name="_Toc237875331"/>
       <w:r>
-        <w:t>First Level Subheading</w:t>
+        <w:t xml:space="preserve">Research Questions</w:t>
       </w:r>
       <w:bookmarkEnd w:id="55"/>
       <w:bookmarkEnd w:id="56"/>
@@ -5393,73 +5002,123 @@
         <w:pStyle w:val="IndentedParagraph"/>
       </w:pPr>
       <w:r>
-        <w:t>Paragraph starts here</w:t>
-      </w:r>
-    </w:p>
-    <w:p>
-      <w:pPr>
-        <w:pStyle w:val="Heading3"/>
-      </w:pPr>
-      <w:bookmarkStart w:id="60" w:name="_Toc226371103"/>
-      <w:bookmarkStart w:id="61" w:name="_Toc237875332"/>
-      <w:r>
-        <w:t>Second level subheading</w:t>
-      </w:r>
-      <w:bookmarkEnd w:id="60"/>
-      <w:bookmarkEnd w:id="61"/>
+        <w:t xml:space="preserve">This thesis addresses two research questions.</w:t>
+      </w:r>
     </w:p>
     <w:p>
       <w:pPr>
         <w:pStyle w:val="IndentedParagraph"/>
       </w:pPr>
       <w:r>
-        <w:t xml:space="preserve">Paragraph starts here </w:t>
-      </w:r>
-      <w:bookmarkStart w:id="62" w:name="_Toc164184621"/>
-      <w:bookmarkStart w:id="63" w:name="_Toc164186315"/>
-      <w:bookmarkStart w:id="64" w:name="_Toc166245113"/>
-    </w:p>
-    <w:p>
-      <w:pPr>
-        <w:pStyle w:val="Heading4"/>
-      </w:pPr>
-      <w:bookmarkStart w:id="65" w:name="_Toc226371104"/>
-      <w:bookmarkStart w:id="66" w:name="_Toc237875333"/>
-      <w:r>
-        <w:t>Third Level Subheading</w:t>
-      </w:r>
-      <w:bookmarkEnd w:id="62"/>
-      <w:bookmarkEnd w:id="63"/>
-      <w:bookmarkEnd w:id="64"/>
-      <w:bookmarkEnd w:id="65"/>
-      <w:bookmarkEnd w:id="66"/>
+        <w:t xml:space="preserve">RQ1: How accurately can PM₂.₅ be estimated from Sentinel-2 imagery at monitoring stations never seen during training?</w:t>
+      </w:r>
     </w:p>
     <w:p>
       <w:pPr>
         <w:pStyle w:val="IndentedParagraph"/>
       </w:pPr>
       <w:r>
-        <w:t>Paragraph starts here</w:t>
-      </w:r>
-    </w:p>
-    <w:p>
-      <w:pPr>
-        <w:pStyle w:val="Heading5"/>
-      </w:pPr>
-      <w:bookmarkStart w:id="67" w:name="_Toc226371105"/>
-      <w:bookmarkStart w:id="68" w:name="_Toc237875334"/>
-      <w:r>
-        <w:t>Fourth Level Subheading</w:t>
-      </w:r>
-      <w:bookmarkEnd w:id="67"/>
-      <w:bookmarkEnd w:id="68"/>
+        <w:t xml:space="preserve">RQ2: Does adding spatial, temporal and meteorological context improve estimation at unmonitored locations, and does the fusion method matter?</w:t>
+      </w:r>
     </w:p>
     <w:p>
       <w:pPr>
         <w:pStyle w:val="IndentedParagraph"/>
       </w:pPr>
       <w:r>
-        <w:t>Paragraph starts here</w:t>
+        <w:t xml:space="preserve">The first question concerns the accuracy that can be expected when the model is applied to a new location, which is different from the accuracy at stations that were also used for training. To answer it, I report the overall accuracy at held-out stations and also examine what the model is able to tell us: which places are more polluted, when pollution episodes occur and how air quality changes from day to day. The second question concerns the value of information beyond the image. Here the spatial context is the latitude, longitude and elevation of the location, the temporal context is the day of the year and the elevation of the sun at the time of the overpass, and the meteorological context is the temperature, humidity, wind speed, precipitation and surface pressure of that day.</w:t>
+      </w:r>
+    </w:p>
+    <w:p>
+      <w:pPr>
+        <w:pStyle w:val="Heading2"/>
+      </w:pPr>
+      <w:bookmarkStart w:id="55" w:name="_Toc164184610"/>
+      <w:bookmarkStart w:id="56" w:name="_Toc164186304"/>
+      <w:bookmarkStart w:id="57" w:name="_Toc166245102"/>
+      <w:bookmarkStart w:id="58" w:name="_Toc226371102"/>
+      <w:bookmarkStart w:id="59" w:name="_Toc237875331"/>
+      <w:r>
+        <w:t xml:space="preserve">Contributions</w:t>
+      </w:r>
+      <w:bookmarkEnd w:id="55"/>
+      <w:bookmarkEnd w:id="56"/>
+      <w:bookmarkEnd w:id="57"/>
+      <w:bookmarkEnd w:id="58"/>
+      <w:bookmarkEnd w:id="59"/>
+    </w:p>
+    <w:p>
+      <w:pPr>
+        <w:pStyle w:val="IndentedParagraph"/>
+      </w:pPr>
+      <w:r>
+        <w:t xml:space="preserve">The primary contributions of this work are threefold:</w:t>
+      </w:r>
+    </w:p>
+    <w:p>
+      <w:pPr>
+        <w:pStyle w:val="IndentedParagraph"/>
+      </w:pPr>
+      <w:r>
+        <w:t xml:space="preserve">(1) A dataset and training framework for PM₂.₅ estimation from Sentinel-2 imagery, consisting of 54,347 quality-controlled scenes at 199 monitoring stations in five states, in which every image is labeled with the PM₂.₅ concentration measured within one hour of the satellite overpass.</w:t>
+      </w:r>
+    </w:p>
+    <w:p>
+      <w:pPr>
+        <w:pStyle w:val="IndentedParagraph"/>
+      </w:pPr>
+      <w:r>
+        <w:t xml:space="preserve">(2) An evaluation of how spatial, temporal and meteorological context should be combined with satellite imagery, which shows that the fusion method determines whether the added context helps or harms estimation at unseen locations.</w:t>
+      </w:r>
+    </w:p>
+    <w:p>
+      <w:pPr>
+        <w:pStyle w:val="IndentedParagraph"/>
+      </w:pPr>
+      <w:r>
+        <w:t xml:space="preserve">(3) An empirical evaluation at held-out monitoring stations, repeated on two independent station splits, in which the final model reaches a coefficient of determination (R²) of 0.435 on both splits with a mean absolute error of about 4 µg/m³, together with an analysis of which components of PM₂.₅ variability the model can and cannot recover.</w:t>
+      </w:r>
+    </w:p>
+    <w:p>
+      <w:pPr>
+        <w:pStyle w:val="IndentedParagraph"/>
+      </w:pPr>
+      <w:r>
+        <w:t xml:space="preserve">Together, these contributions provide a foundation for estimating PM₂.₅ at locations without monitors, which can inform environmental sustainability assessment, sustainable urban planning and long-term public health decision-making.</w:t>
+      </w:r>
+    </w:p>
+    <w:p>
+      <w:pPr>
+        <w:pStyle w:val="Heading2"/>
+      </w:pPr>
+      <w:bookmarkStart w:id="55" w:name="_Toc164184610"/>
+      <w:bookmarkStart w:id="56" w:name="_Toc164186304"/>
+      <w:bookmarkStart w:id="57" w:name="_Toc166245102"/>
+      <w:bookmarkStart w:id="58" w:name="_Toc226371102"/>
+      <w:bookmarkStart w:id="59" w:name="_Toc237875331"/>
+      <w:r>
+        <w:t xml:space="preserve">Organization of the Thesis</w:t>
+      </w:r>
+      <w:bookmarkEnd w:id="55"/>
+      <w:bookmarkEnd w:id="56"/>
+      <w:bookmarkEnd w:id="57"/>
+      <w:bookmarkEnd w:id="58"/>
+      <w:bookmarkEnd w:id="59"/>
+    </w:p>
+    <w:p>
+      <w:pPr>
+        <w:pStyle w:val="IndentedParagraph"/>
+      </w:pPr>
+      <w:r>
+        <w:t xml:space="preserve">The remainder of this thesis is organized as follows. Chapter 2 reviews the literature on PM₂.₅ and public health, ground-based monitoring, satellite-based estimation and the direct use of high-resolution imagery, and it identifies the gaps that motivate this work. Chapter 3 describes the data sources, the preprocessing, the model architecture and the evaluation protocol. Chapter 4 presents the results for the two research questions. Chapter 5 discusses the findings, compares them with the literature and states the limitations. Chapter 6 concludes the thesis and outlines directions for future work.</w:t>
+      </w:r>
+    </w:p>
+    <w:p>
+      <w:pPr>
+        <w:pStyle w:val="IndentedParagraph"/>
+      </w:pPr>
+      <w:r>
+        <w:t/>
       </w:r>
       <w:r>
         <w:br w:type="page"/>

</xml_diff>

<commit_message>
Thesis formatting fixes per the Purdue Standard Thesis Handbook: sentence-case subheadings, real subscripts, page break inside last paragraph, no duplicate ids
Co-Authored-By: Claude Fable 5.1 <noreply@anthropic.com>
</commit_message>
<xml_diff>
--- a/docs/thesis/thesis.docx
+++ b/docs/thesis/thesis.docx
@@ -4936,7 +4936,34 @@
         <w:pStyle w:val="IndentedParagraph"/>
       </w:pPr>
       <w:r>
-        <w:t xml:space="preserve">Fine particulate matter with an aerodynamic diameter less than 2.5 micrometers (PM₂.₅) is among the most harmful air pollutants due to its ability to penetrate deep into the respiratory system and enter the bloodstream. Long term exposure to elevated PM₂.₅ concentrations has been strongly associated with respiratory and cardiovascular diseases, premature mortality and reduced quality of life. As urbanization and industrial activity continue to intensify worldwide, the ability to monitor and manage PM₂.₅ levels has become a critical component of environmental sustainability, public health protection and sustainable urban development, supporting long-term strategies aimed at reducing population exposure and improving overall well-being.</w:t>
+        <w:t xml:space="preserve">Fine particulate matter with an aerodynamic diameter less than 2.5 micrometers (PM</w:t>
+      </w:r>
+      <w:r>
+        <w:rPr>
+          <w:vertAlign w:val="subscript"/>
+        </w:rPr>
+        <w:t xml:space="preserve">2.5</w:t>
+      </w:r>
+      <w:r>
+        <w:t xml:space="preserve">) is among the most harmful air pollutants due to its ability to penetrate deep into the respiratory system and enter the bloodstream. Long term exposure to elevated PM</w:t>
+      </w:r>
+      <w:r>
+        <w:rPr>
+          <w:vertAlign w:val="subscript"/>
+        </w:rPr>
+        <w:t xml:space="preserve">2.5</w:t>
+      </w:r>
+      <w:r>
+        <w:t xml:space="preserve"> concentrations has been strongly associated with respiratory and cardiovascular diseases, premature mortality and reduced quality of life. As urbanization and industrial activity continue to intensify worldwide, the ability to monitor and manage PM</w:t>
+      </w:r>
+      <w:r>
+        <w:rPr>
+          <w:vertAlign w:val="subscript"/>
+        </w:rPr>
+        <w:t xml:space="preserve">2.5</w:t>
+      </w:r>
+      <w:r>
+        <w:t xml:space="preserve"> levels has become a critical component of environmental sustainability, public health protection and sustainable urban development, supporting long-term strategies aimed at reducing population exposure and improving overall well-being.</w:t>
       </w:r>
     </w:p>
     <w:p>
@@ -4952,7 +4979,16 @@
         <w:pStyle w:val="IndentedParagraph"/>
       </w:pPr>
       <w:r>
-        <w:t xml:space="preserve">Satellite remote sensing has emerged as a valuable complement to ground-based monitoring by offering consistent observations over broad spatial extents. Many existing satellite-based approaches for estimating PM₂.₅ concentrations rely on aerosol optical depth (AOD) products and their integration with meteorological variables and chemical transport models. Although these methods have demonstrated effectiveness at regional and global scales, they often face challenges related to cloud contamination, uncertainties in vertical aerosol distribution and relatively coarse spatial resolution. These limitations can restrict their application for localized air quality assessment and sustainability-focused urban analysis, where fine-scale spatial detail is essential.</w:t>
+        <w:t xml:space="preserve">Satellite remote sensing has emerged as a valuable complement to ground-based monitoring by offering consistent observations over broad spatial extents. Many existing satellite-based approaches for estimating PM</w:t>
+      </w:r>
+      <w:r>
+        <w:rPr>
+          <w:vertAlign w:val="subscript"/>
+        </w:rPr>
+        <w:t xml:space="preserve">2.5</w:t>
+      </w:r>
+      <w:r>
+        <w:t xml:space="preserve"> concentrations rely on aerosol optical depth (AOD) products and their integration with meteorological variables and chemical transport models. Although these methods have demonstrated effectiveness at regional and global scales, they often face challenges related to cloud contamination, uncertainties in vertical aerosol distribution and relatively coarse spatial resolution. These limitations can restrict their application for localized air quality assessment and sustainability-focused urban analysis, where fine-scale spatial detail is essential.</w:t>
       </w:r>
     </w:p>
     <w:p>
@@ -4960,7 +4996,25 @@
         <w:pStyle w:val="IndentedParagraph"/>
       </w:pPr>
       <w:r>
-        <w:t xml:space="preserve">Recent advances in high-resolution Earth observation have opened new opportunities for data-driven air quality monitoring. The Sentinel-2 satellite constellation provides optical imagery at spatial resolutions as fine as 10 meters, capturing detailed information about land cover, urban structure and surface reflectance. Such surface characteristics are closely linked to emission sources, dispersion patterns and human activity and therefore serve as indirect indicators of PM₂.₅ variability. In addition, when the imagery is used before atmospheric correction, it also records the haze and smoke present in the air above the surface, which is a direct visual signature of particulate pollution. Because Sentinel-2 imagery is free and covers the whole globe, it is a promising data source for estimating PM₂.₅ in places where no monitor exists.</w:t>
+        <w:t xml:space="preserve">Recent advances in high-resolution Earth observation have opened new opportunities for data-driven air quality monitoring. The Sentinel-2 satellite constellation provides optical imagery at spatial resolutions as fine as 10 meters, capturing detailed information about land cover, urban structure and surface reflectance. Such surface characteristics are closely linked to emission sources, dispersion patterns and human activity and therefore serve as indirect indicators of PM</w:t>
+      </w:r>
+      <w:r>
+        <w:rPr>
+          <w:vertAlign w:val="subscript"/>
+        </w:rPr>
+        <w:t xml:space="preserve">2.5</w:t>
+      </w:r>
+      <w:r>
+        <w:t xml:space="preserve"> variability. In addition, when the imagery is used before atmospheric correction, it also records the haze and smoke present in the air above the surface, which is a direct visual signature of particulate pollution. Because Sentinel-2 imagery is free and covers the whole globe, it is a promising data source for estimating PM</w:t>
+      </w:r>
+      <w:r>
+        <w:rPr>
+          <w:vertAlign w:val="subscript"/>
+        </w:rPr>
+        <w:t xml:space="preserve">2.5</w:t>
+      </w:r>
+      <w:r>
+        <w:t xml:space="preserve"> in places where no monitor exists.</w:t>
       </w:r>
     </w:p>
     <w:p>
@@ -4968,7 +5022,25 @@
         <w:pStyle w:val="IndentedParagraph"/>
       </w:pPr>
       <w:r>
-        <w:t xml:space="preserve">In this thesis, I investigate how accurately PM₂.₅ can be estimated from Sentinel-2 imagery at locations that have no ground monitor. I pair every usable Sentinel-2 pass over 199 EPA reference monitoring stations in five U.S. states, from 2020 to 2025, with the PM₂.₅ concentration measured at the station within one hour of the satellite overpass. A convolutional neural network is trained end to end on these pairs of images and measurements, and it is then combined with spatial, temporal and meteorological context that is available for any point on Earth without ground instruments. All results are reported at monitoring stations that were never seen during training, because this is the condition under which such a model would actually be used.</w:t>
+        <w:t xml:space="preserve">In this thesis, I investigate how accurately PM</w:t>
+      </w:r>
+      <w:r>
+        <w:rPr>
+          <w:vertAlign w:val="subscript"/>
+        </w:rPr>
+        <w:t xml:space="preserve">2.5</w:t>
+      </w:r>
+      <w:r>
+        <w:t xml:space="preserve"> can be estimated from Sentinel-2 imagery at locations that have no ground monitor. I pair every usable Sentinel-2 pass over 199 EPA reference monitoring stations in five U.S. states, from 2020 to 2025, with the PM</w:t>
+      </w:r>
+      <w:r>
+        <w:rPr>
+          <w:vertAlign w:val="subscript"/>
+        </w:rPr>
+        <w:t xml:space="preserve">2.5</w:t>
+      </w:r>
+      <w:r>
+        <w:t xml:space="preserve"> concentration measured at the station within one hour of the satellite overpass. A convolutional neural network is trained end to end on these pairs of images and measurements, and it is then combined with spatial, temporal and meteorological context that is available for any point on Earth without ground instruments. All results are reported at monitoring stations that were never seen during training, because this is the condition under which such a model would actually be used.</w:t>
       </w:r>
     </w:p>
     <w:p>
@@ -4976,26 +5048,25 @@
         <w:pStyle w:val="IndentedParagraph"/>
       </w:pPr>
       <w:r>
-        <w:t xml:space="preserve">The approach that I originally proposed used atmospherically corrected weekly composite images, weekly averaged PM₂.₅ labels and a pretrained network with frozen weights. When I evaluated it at unseen stations, it did not produce any signal that transferred to them. A large part of this work was therefore spent on understanding why, and the final design differs from the proposal in the imagery product, in how the labels are matched to the images in time, in how the network is trained and in how the context is fused with the image. These changes are described and justified in Chapter 3.</w:t>
+        <w:t xml:space="preserve">The approach that I originally proposed used atmospherically corrected weekly composite images, weekly averaged PM</w:t>
+      </w:r>
+      <w:r>
+        <w:rPr>
+          <w:vertAlign w:val="subscript"/>
+        </w:rPr>
+        <w:t xml:space="preserve">2.5</w:t>
+      </w:r>
+      <w:r>
+        <w:t xml:space="preserve"> labels and a pretrained network with frozen weights. When I evaluated it at unseen stations, it did not produce any signal that transferred to them. A large part of this work was therefore spent on understanding why, and the final design differs from the proposal in the imagery product, in how the labels are matched to the images in time, in how the network is trained and in how the context is fused with the image. These changes are described and justified in Chapter 3.</w:t>
       </w:r>
     </w:p>
     <w:p>
       <w:pPr>
         <w:pStyle w:val="Heading2"/>
       </w:pPr>
-      <w:bookmarkStart w:id="55" w:name="_Toc164184610"/>
-      <w:bookmarkStart w:id="56" w:name="_Toc164186304"/>
-      <w:bookmarkStart w:id="57" w:name="_Toc166245102"/>
-      <w:bookmarkStart w:id="58" w:name="_Toc226371102"/>
-      <w:bookmarkStart w:id="59" w:name="_Toc237875331"/>
-      <w:r>
-        <w:t xml:space="preserve">Research Questions</w:t>
-      </w:r>
-      <w:bookmarkEnd w:id="55"/>
-      <w:bookmarkEnd w:id="56"/>
-      <w:bookmarkEnd w:id="57"/>
-      <w:bookmarkEnd w:id="58"/>
-      <w:bookmarkEnd w:id="59"/>
+      <w:r>
+        <w:t xml:space="preserve">Research questions</w:t>
+      </w:r>
     </w:p>
     <w:p>
       <w:pPr>
@@ -5010,7 +5081,16 @@
         <w:pStyle w:val="IndentedParagraph"/>
       </w:pPr>
       <w:r>
-        <w:t xml:space="preserve">RQ1: How accurately can PM₂.₅ be estimated from Sentinel-2 imagery at monitoring stations never seen during training?</w:t>
+        <w:t xml:space="preserve">RQ1: How accurately can PM</w:t>
+      </w:r>
+      <w:r>
+        <w:rPr>
+          <w:vertAlign w:val="subscript"/>
+        </w:rPr>
+        <w:t xml:space="preserve">2.5</w:t>
+      </w:r>
+      <w:r>
+        <w:t xml:space="preserve"> be estimated from Sentinel-2 imagery at monitoring stations never seen during training?</w:t>
       </w:r>
     </w:p>
     <w:p>
@@ -5033,19 +5113,9 @@
       <w:pPr>
         <w:pStyle w:val="Heading2"/>
       </w:pPr>
-      <w:bookmarkStart w:id="55" w:name="_Toc164184610"/>
-      <w:bookmarkStart w:id="56" w:name="_Toc164186304"/>
-      <w:bookmarkStart w:id="57" w:name="_Toc166245102"/>
-      <w:bookmarkStart w:id="58" w:name="_Toc226371102"/>
-      <w:bookmarkStart w:id="59" w:name="_Toc237875331"/>
       <w:r>
         <w:t xml:space="preserve">Contributions</w:t>
       </w:r>
-      <w:bookmarkEnd w:id="55"/>
-      <w:bookmarkEnd w:id="56"/>
-      <w:bookmarkEnd w:id="57"/>
-      <w:bookmarkEnd w:id="58"/>
-      <w:bookmarkEnd w:id="59"/>
     </w:p>
     <w:p>
       <w:pPr>
@@ -5060,7 +5130,25 @@
         <w:pStyle w:val="IndentedParagraph"/>
       </w:pPr>
       <w:r>
-        <w:t xml:space="preserve">(1) A dataset and training framework for PM₂.₅ estimation from Sentinel-2 imagery, consisting of 54,347 quality-controlled scenes at 199 monitoring stations in five states, in which every image is labeled with the PM₂.₅ concentration measured within one hour of the satellite overpass.</w:t>
+        <w:t xml:space="preserve">(1) A dataset and training framework for PM</w:t>
+      </w:r>
+      <w:r>
+        <w:rPr>
+          <w:vertAlign w:val="subscript"/>
+        </w:rPr>
+        <w:t xml:space="preserve">2.5</w:t>
+      </w:r>
+      <w:r>
+        <w:t xml:space="preserve"> estimation from Sentinel-2 imagery, consisting of 54,347 quality-controlled scenes at 199 monitoring stations in five states, in which every image is labeled with the PM</w:t>
+      </w:r>
+      <w:r>
+        <w:rPr>
+          <w:vertAlign w:val="subscript"/>
+        </w:rPr>
+        <w:t xml:space="preserve">2.5</w:t>
+      </w:r>
+      <w:r>
+        <w:t xml:space="preserve"> concentration measured within one hour of the satellite overpass.</w:t>
       </w:r>
     </w:p>
     <w:p>
@@ -5076,7 +5164,34 @@
         <w:pStyle w:val="IndentedParagraph"/>
       </w:pPr>
       <w:r>
-        <w:t xml:space="preserve">(3) An empirical evaluation at held-out monitoring stations, repeated on two independent station splits, in which the final model reaches a coefficient of determination (R²) of 0.435 on both splits with a mean absolute error of about 4 µg/m³, together with an analysis of which components of PM₂.₅ variability the model can and cannot recover.</w:t>
+        <w:t xml:space="preserve">(3) An empirical evaluation at held-out monitoring stations, repeated on two independent station splits, in which the final model reaches a coefficient of determination (R</w:t>
+      </w:r>
+      <w:r>
+        <w:rPr>
+          <w:vertAlign w:val="superscript"/>
+        </w:rPr>
+        <w:t xml:space="preserve">2</w:t>
+      </w:r>
+      <w:r>
+        <w:t xml:space="preserve">) of 0.435 on both splits with a mean absolute error of about 4 µg/m</w:t>
+      </w:r>
+      <w:r>
+        <w:rPr>
+          <w:vertAlign w:val="superscript"/>
+        </w:rPr>
+        <w:t xml:space="preserve">3</w:t>
+      </w:r>
+      <w:r>
+        <w:t xml:space="preserve">, together with an analysis of which components of PM</w:t>
+      </w:r>
+      <w:r>
+        <w:rPr>
+          <w:vertAlign w:val="subscript"/>
+        </w:rPr>
+        <w:t xml:space="preserve">2.5</w:t>
+      </w:r>
+      <w:r>
+        <w:t xml:space="preserve"> variability the model can and cannot recover.</w:t>
       </w:r>
     </w:p>
     <w:p>
@@ -5084,41 +5199,41 @@
         <w:pStyle w:val="IndentedParagraph"/>
       </w:pPr>
       <w:r>
-        <w:t xml:space="preserve">Together, these contributions provide a foundation for estimating PM₂.₅ at locations without monitors, which can inform environmental sustainability assessment, sustainable urban planning and long-term public health decision-making.</w:t>
+        <w:t xml:space="preserve">Together, these contributions provide a foundation for estimating PM</w:t>
+      </w:r>
+      <w:r>
+        <w:rPr>
+          <w:vertAlign w:val="subscript"/>
+        </w:rPr>
+        <w:t xml:space="preserve">2.5</w:t>
+      </w:r>
+      <w:r>
+        <w:t xml:space="preserve"> at locations without monitors, which can inform environmental sustainability assessment, sustainable urban planning and long-term public health decision-making.</w:t>
       </w:r>
     </w:p>
     <w:p>
       <w:pPr>
         <w:pStyle w:val="Heading2"/>
       </w:pPr>
-      <w:bookmarkStart w:id="55" w:name="_Toc164184610"/>
-      <w:bookmarkStart w:id="56" w:name="_Toc164186304"/>
-      <w:bookmarkStart w:id="57" w:name="_Toc166245102"/>
-      <w:bookmarkStart w:id="58" w:name="_Toc226371102"/>
-      <w:bookmarkStart w:id="59" w:name="_Toc237875331"/>
-      <w:r>
-        <w:t xml:space="preserve">Organization of the Thesis</w:t>
-      </w:r>
-      <w:bookmarkEnd w:id="55"/>
-      <w:bookmarkEnd w:id="56"/>
-      <w:bookmarkEnd w:id="57"/>
-      <w:bookmarkEnd w:id="58"/>
-      <w:bookmarkEnd w:id="59"/>
+      <w:r>
+        <w:t xml:space="preserve">Organization of the thesis</w:t>
+      </w:r>
     </w:p>
     <w:p>
       <w:pPr>
         <w:pStyle w:val="IndentedParagraph"/>
       </w:pPr>
       <w:r>
-        <w:t xml:space="preserve">The remainder of this thesis is organized as follows. Chapter 2 reviews the literature on PM₂.₅ and public health, ground-based monitoring, satellite-based estimation and the direct use of high-resolution imagery, and it identifies the gaps that motivate this work. Chapter 3 describes the data sources, the preprocessing, the model architecture and the evaluation protocol. Chapter 4 presents the results for the two research questions. Chapter 5 discusses the findings, compares them with the literature and states the limitations. Chapter 6 concludes the thesis and outlines directions for future work.</w:t>
-      </w:r>
-    </w:p>
-    <w:p>
-      <w:pPr>
-        <w:pStyle w:val="IndentedParagraph"/>
-      </w:pPr>
-      <w:r>
-        <w:t/>
+        <w:t xml:space="preserve">The remainder of this thesis is organized as follows. Chapter 2 reviews the literature on PM</w:t>
+      </w:r>
+      <w:r>
+        <w:rPr>
+          <w:vertAlign w:val="subscript"/>
+        </w:rPr>
+        <w:t xml:space="preserve">2.5</w:t>
+      </w:r>
+      <w:r>
+        <w:t xml:space="preserve"> and public health, ground-based monitoring, satellite-based estimation and the direct use of high-resolution imagery, and it identifies the gaps that motivate this work. Chapter 3 describes the data sources, the preprocessing, the model architecture and the evaluation protocol. Chapter 4 presents the results for the two research questions. Chapter 5 discusses the findings, compares them with the literature and states the limitations. Chapter 6 concludes the thesis and outlines directions for future work.</w:t>
       </w:r>
       <w:r>
         <w:br w:type="page"/>

</xml_diff>

<commit_message>
Thesis: acknowledgments page break moved to the last paragraph
Co-Authored-By: Claude Fable 5.1 <noreply@anthropic.com>
</commit_message>
<xml_diff>
--- a/docs/thesis/thesis.docx
+++ b/docs/thesis/thesis.docx
@@ -1546,12 +1546,6 @@
         </w:rPr>
         <w:t xml:space="preserve"/>
       </w:r>
-      <w:r>
-        <w:rPr>
-          <w:iCs/>
-        </w:rPr>
-        <w:br w:type="page"/>
-      </w:r>
     </w:p>
     <w:p>
       <w:pPr>
@@ -1565,6 +1559,9 @@
       </w:r>
       <w:proofErr w:type="gramStart"/>
       <w:proofErr w:type="gramEnd"/>
+      <w:r>
+        <w:br w:type="page"/>
+      </w:r>
     </w:p>
     <w:p>
       <w:pPr>

</xml_diff>